<commit_message>
updated files to meet standards for visual impairment
</commit_message>
<xml_diff>
--- a/assets/deepak/day1/day1-1_setup.docx
+++ b/assets/deepak/day1/day1-1_setup.docx
@@ -229,13 +229,14 @@
           <w:left w:w="144" w:type="dxa"/>
           <w:right w:w="144" w:type="dxa"/>
         </w:tblCellMar>
-        <w:tblLook w:val="0000" w:firstRow="0" w:lastRow="0" w:firstColumn="0" w:lastColumn="0" w:noHBand="0" w:noVBand="0"/>
+        <w:tblLook w:val="0020" w:firstRow="1" w:lastRow="0" w:firstColumn="0" w:lastColumn="0" w:noHBand="0" w:noVBand="0"/>
       </w:tblPr>
       <w:tblGrid>
-        <w:gridCol w:w="9648"/>
+        <w:gridCol w:w="9325"/>
       </w:tblGrid>
       <w:tr>
         <w:trPr>
+          <w:cnfStyle w:val="100000000000" w:firstRow="1" w:lastRow="0" w:firstColumn="0" w:lastColumn="0" w:oddVBand="0" w:evenVBand="0" w:oddHBand="0" w:evenHBand="0" w:firstRowFirstColumn="0" w:firstRowLastColumn="0" w:lastRowFirstColumn="0" w:lastRowLastColumn="0"/>
           <w:cantSplit/>
         </w:trPr>
         <w:tc>
@@ -254,53 +255,7 @@
               <w:textAlignment w:val="center"/>
             </w:pPr>
             <w:r>
-              <w:rPr>
-                <w:noProof/>
-              </w:rPr>
-              <w:drawing>
-                <wp:inline distT="0" distB="0" distL="0" distR="0" wp14:anchorId="4ECD5498" wp14:editId="36331879">
-                  <wp:extent cx="152400" cy="152400"/>
-                  <wp:effectExtent l="0" t="0" r="0" b="0"/>
-                  <wp:docPr id="26" name="Picture"/>
-                  <wp:cNvGraphicFramePr/>
-                  <a:graphic xmlns:a="http://schemas.openxmlformats.org/drawingml/2006/main">
-                    <a:graphicData uri="http://schemas.openxmlformats.org/drawingml/2006/picture">
-                      <pic:pic xmlns:pic="http://schemas.openxmlformats.org/drawingml/2006/picture">
-                        <pic:nvPicPr>
-                          <pic:cNvPr id="27" name="Picture" descr="/Applications/RStudio.app/Contents/Resources/app/quarto/share/formats/docx/warning.png"/>
-                          <pic:cNvPicPr>
-                            <a:picLocks noChangeAspect="1" noChangeArrowheads="1"/>
-                          </pic:cNvPicPr>
-                        </pic:nvPicPr>
-                        <pic:blipFill>
-                          <a:blip r:embed="rId7"/>
-                          <a:stretch>
-                            <a:fillRect/>
-                          </a:stretch>
-                        </pic:blipFill>
-                        <pic:spPr bwMode="auto">
-                          <a:xfrm>
-                            <a:off x="0" y="0"/>
-                            <a:ext cx="152400" cy="152400"/>
-                          </a:xfrm>
-                          <a:prstGeom prst="rect">
-                            <a:avLst/>
-                          </a:prstGeom>
-                          <a:noFill/>
-                          <a:ln w="9525">
-                            <a:noFill/>
-                            <a:headEnd/>
-                            <a:tailEnd/>
-                          </a:ln>
-                        </pic:spPr>
-                      </pic:pic>
-                    </a:graphicData>
-                  </a:graphic>
-                </wp:inline>
-              </w:drawing>
-            </w:r>
-            <w:r>
-              <w:t xml:space="preserve">  Modify the script</w:t>
+              <w:t xml:space="preserve"> Modify the script</w:t>
             </w:r>
           </w:p>
         </w:tc>
@@ -483,6 +438,20 @@
     </w:p>
     <w:p>
       <w:pPr>
+        <w:pStyle w:val="BodyText"/>
+      </w:pPr>
+      <w:r>
+        <w:t xml:space="preserve">Code </w:t>
+      </w:r>
+      <w:r>
+        <w:t>end</w:t>
+      </w:r>
+      <w:r>
+        <w:t>s here:</w:t>
+      </w:r>
+    </w:p>
+    <w:p>
+      <w:pPr>
         <w:pStyle w:val="FirstParagraph"/>
       </w:pPr>
       <w:r>
@@ -581,13 +550,14 @@
           <w:left w:w="144" w:type="dxa"/>
           <w:right w:w="144" w:type="dxa"/>
         </w:tblCellMar>
-        <w:tblLook w:val="0000" w:firstRow="0" w:lastRow="0" w:firstColumn="0" w:lastColumn="0" w:noHBand="0" w:noVBand="0"/>
+        <w:tblLook w:val="0020" w:firstRow="1" w:lastRow="0" w:firstColumn="0" w:lastColumn="0" w:noHBand="0" w:noVBand="0"/>
       </w:tblPr>
       <w:tblGrid>
-        <w:gridCol w:w="9648"/>
+        <w:gridCol w:w="9325"/>
       </w:tblGrid>
       <w:tr>
         <w:trPr>
+          <w:cnfStyle w:val="100000000000" w:firstRow="1" w:lastRow="0" w:firstColumn="0" w:lastColumn="0" w:oddVBand="0" w:evenVBand="0" w:oddHBand="0" w:evenHBand="0" w:firstRowFirstColumn="0" w:firstRowLastColumn="0" w:lastRowFirstColumn="0" w:lastRowLastColumn="0"/>
           <w:cantSplit/>
         </w:trPr>
         <w:tc>
@@ -605,52 +575,6 @@
               <w:spacing w:before="0" w:after="0"/>
               <w:textAlignment w:val="center"/>
             </w:pPr>
-            <w:r>
-              <w:rPr>
-                <w:noProof/>
-              </w:rPr>
-              <w:drawing>
-                <wp:inline distT="0" distB="0" distL="0" distR="0" wp14:anchorId="17B2871C" wp14:editId="36F5EB2E">
-                  <wp:extent cx="152400" cy="152400"/>
-                  <wp:effectExtent l="0" t="0" r="0" b="0"/>
-                  <wp:docPr id="29" name="Picture"/>
-                  <wp:cNvGraphicFramePr/>
-                  <a:graphic xmlns:a="http://schemas.openxmlformats.org/drawingml/2006/main">
-                    <a:graphicData uri="http://schemas.openxmlformats.org/drawingml/2006/picture">
-                      <pic:pic xmlns:pic="http://schemas.openxmlformats.org/drawingml/2006/picture">
-                        <pic:nvPicPr>
-                          <pic:cNvPr id="30" name="Picture" descr="/Applications/RStudio.app/Contents/Resources/app/quarto/share/formats/docx/note.png"/>
-                          <pic:cNvPicPr>
-                            <a:picLocks noChangeAspect="1" noChangeArrowheads="1"/>
-                          </pic:cNvPicPr>
-                        </pic:nvPicPr>
-                        <pic:blipFill>
-                          <a:blip r:embed="rId8"/>
-                          <a:stretch>
-                            <a:fillRect/>
-                          </a:stretch>
-                        </pic:blipFill>
-                        <pic:spPr bwMode="auto">
-                          <a:xfrm>
-                            <a:off x="0" y="0"/>
-                            <a:ext cx="152400" cy="152400"/>
-                          </a:xfrm>
-                          <a:prstGeom prst="rect">
-                            <a:avLst/>
-                          </a:prstGeom>
-                          <a:noFill/>
-                          <a:ln w="9525">
-                            <a:noFill/>
-                            <a:headEnd/>
-                            <a:tailEnd/>
-                          </a:ln>
-                        </pic:spPr>
-                      </pic:pic>
-                    </a:graphicData>
-                  </a:graphic>
-                </wp:inline>
-              </w:drawing>
-            </w:r>
             <w:r>
               <w:t xml:space="preserve">  About the options</w:t>
             </w:r>
@@ -732,7 +656,7 @@
       <w:r>
         <w:t xml:space="preserve">To simply run the environment, you can use </w:t>
       </w:r>
-      <w:hyperlink r:id="rId9">
+      <w:hyperlink r:id="rId7">
         <w:r>
           <w:rPr>
             <w:rStyle w:val="Hyperlink"/>
@@ -743,7 +667,7 @@
       <w:r>
         <w:t xml:space="preserve">. You can find the repository (including the image) here: </w:t>
       </w:r>
-      <w:hyperlink r:id="rId10">
+      <w:hyperlink r:id="rId8">
         <w:r>
           <w:rPr>
             <w:rStyle w:val="Hyperlink"/>
@@ -799,22 +723,22 @@
         </w:rPr>
         <w:lastRenderedPageBreak/>
         <w:drawing>
-          <wp:inline distT="0" distB="0" distL="0" distR="0" wp14:anchorId="134C0B6C" wp14:editId="675EDB30">
+          <wp:inline distT="0" distB="0" distL="0" distR="0" wp14:anchorId="134C0B6C" wp14:editId="6ADF3F0F">
             <wp:extent cx="1905000" cy="1545123"/>
             <wp:effectExtent l="0" t="0" r="0" b="0"/>
-            <wp:docPr id="34" name="Picture"/>
+            <wp:docPr id="34" name="Picture" descr="screenshot to create new project"/>
             <wp:cNvGraphicFramePr/>
             <a:graphic xmlns:a="http://schemas.openxmlformats.org/drawingml/2006/main">
               <a:graphicData uri="http://schemas.openxmlformats.org/drawingml/2006/picture">
                 <pic:pic xmlns:pic="http://schemas.openxmlformats.org/drawingml/2006/picture">
                   <pic:nvPicPr>
-                    <pic:cNvPr id="35" name="Picture" descr="../assets/images/create_new_project.png"/>
+                    <pic:cNvPr id="34" name="Picture" descr="screenshot to create new project"/>
                     <pic:cNvPicPr>
                       <a:picLocks noChangeAspect="1" noChangeArrowheads="1"/>
                     </pic:cNvPicPr>
                   </pic:nvPicPr>
                   <pic:blipFill>
-                    <a:blip r:embed="rId11"/>
+                    <a:blip r:embed="rId9"/>
                     <a:stretch>
                       <a:fillRect/>
                     </a:stretch>
@@ -865,22 +789,22 @@
           <w:noProof/>
         </w:rPr>
         <w:drawing>
-          <wp:inline distT="0" distB="0" distL="0" distR="0" wp14:anchorId="3D0BC00A" wp14:editId="06D3264A">
+          <wp:inline distT="0" distB="0" distL="0" distR="0" wp14:anchorId="3D0BC00A" wp14:editId="5CB75198">
             <wp:extent cx="2857500" cy="2063302"/>
             <wp:effectExtent l="0" t="0" r="0" b="0"/>
-            <wp:docPr id="37" name="Picture"/>
+            <wp:docPr id="37" name="Picture" descr="screenshot to choose new directory for new project creation"/>
             <wp:cNvGraphicFramePr/>
             <a:graphic xmlns:a="http://schemas.openxmlformats.org/drawingml/2006/main">
               <a:graphicData uri="http://schemas.openxmlformats.org/drawingml/2006/picture">
                 <pic:pic xmlns:pic="http://schemas.openxmlformats.org/drawingml/2006/picture">
                   <pic:nvPicPr>
-                    <pic:cNvPr id="38" name="Picture" descr="../assets/images/choose_new_directory.png"/>
+                    <pic:cNvPr id="37" name="Picture" descr="screenshot to choose new directory for new project creation"/>
                     <pic:cNvPicPr>
                       <a:picLocks noChangeAspect="1" noChangeArrowheads="1"/>
                     </pic:cNvPicPr>
                   </pic:nvPicPr>
                   <pic:blipFill>
-                    <a:blip r:embed="rId12"/>
+                    <a:blip r:embed="rId10"/>
                     <a:stretch>
                       <a:fillRect/>
                     </a:stretch>
@@ -931,22 +855,22 @@
           <w:noProof/>
         </w:rPr>
         <w:drawing>
-          <wp:inline distT="0" distB="0" distL="0" distR="0" wp14:anchorId="6D709283" wp14:editId="12B19D2F">
+          <wp:inline distT="0" distB="0" distL="0" distR="0" wp14:anchorId="6D709283" wp14:editId="70F233A7">
             <wp:extent cx="2857500" cy="2057936"/>
             <wp:effectExtent l="0" t="0" r="0" b="0"/>
-            <wp:docPr id="40" name="Picture"/>
+            <wp:docPr id="40" name="Picture" descr="screenshot to show creation of new project"/>
             <wp:cNvGraphicFramePr/>
             <a:graphic xmlns:a="http://schemas.openxmlformats.org/drawingml/2006/main">
               <a:graphicData uri="http://schemas.openxmlformats.org/drawingml/2006/picture">
                 <pic:pic xmlns:pic="http://schemas.openxmlformats.org/drawingml/2006/picture">
                   <pic:nvPicPr>
-                    <pic:cNvPr id="41" name="Picture" descr="../assets/images/choose_new_project.png"/>
+                    <pic:cNvPr id="40" name="Picture" descr="screenshot to show creation of new project"/>
                     <pic:cNvPicPr>
                       <a:picLocks noChangeAspect="1" noChangeArrowheads="1"/>
                     </pic:cNvPicPr>
                   </pic:nvPicPr>
                   <pic:blipFill>
-                    <a:blip r:embed="rId13"/>
+                    <a:blip r:embed="rId11"/>
                     <a:stretch>
                       <a:fillRect/>
                     </a:stretch>
@@ -1010,22 +934,22 @@
         </w:rPr>
         <w:lastRenderedPageBreak/>
         <w:drawing>
-          <wp:inline distT="0" distB="0" distL="0" distR="0" wp14:anchorId="42E7D5A3" wp14:editId="52FBA595">
+          <wp:inline distT="0" distB="0" distL="0" distR="0" wp14:anchorId="42E7D5A3" wp14:editId="7E5370D1">
             <wp:extent cx="2857500" cy="2052570"/>
             <wp:effectExtent l="0" t="0" r="0" b="0"/>
-            <wp:docPr id="43" name="Picture"/>
+            <wp:docPr id="43" name="Picture" descr="screenshot to show new project creation with a name"/>
             <wp:cNvGraphicFramePr/>
             <a:graphic xmlns:a="http://schemas.openxmlformats.org/drawingml/2006/main">
               <a:graphicData uri="http://schemas.openxmlformats.org/drawingml/2006/picture">
                 <pic:pic xmlns:pic="http://schemas.openxmlformats.org/drawingml/2006/picture">
                   <pic:nvPicPr>
-                    <pic:cNvPr id="44" name="Picture" descr="../assets/images/define_directory_name.png"/>
+                    <pic:cNvPr id="43" name="Picture" descr="screenshot to show new project creation with a name"/>
                     <pic:cNvPicPr>
                       <a:picLocks noChangeAspect="1" noChangeArrowheads="1"/>
                     </pic:cNvPicPr>
                   </pic:nvPicPr>
                   <pic:blipFill>
-                    <a:blip r:embed="rId14"/>
+                    <a:blip r:embed="rId12"/>
                     <a:stretch>
                       <a:fillRect/>
                     </a:stretch>
@@ -1088,22 +1012,22 @@
           <w:noProof/>
         </w:rPr>
         <w:drawing>
-          <wp:inline distT="0" distB="0" distL="0" distR="0" wp14:anchorId="1B0C1707" wp14:editId="39DC2F7A">
+          <wp:inline distT="0" distB="0" distL="0" distR="0" wp14:anchorId="1B0C1707" wp14:editId="68F8040F">
             <wp:extent cx="2857500" cy="695067"/>
             <wp:effectExtent l="0" t="0" r="0" b="0"/>
-            <wp:docPr id="46" name="Picture"/>
+            <wp:docPr id="46" name="Picture" descr="screenshot of Terminal in Rstudio"/>
             <wp:cNvGraphicFramePr/>
             <a:graphic xmlns:a="http://schemas.openxmlformats.org/drawingml/2006/main">
               <a:graphicData uri="http://schemas.openxmlformats.org/drawingml/2006/picture">
                 <pic:pic xmlns:pic="http://schemas.openxmlformats.org/drawingml/2006/picture">
                   <pic:nvPicPr>
-                    <pic:cNvPr id="47" name="Picture" descr="../assets/images/select_terminal_tab.png"/>
+                    <pic:cNvPr id="46" name="Picture" descr="screenshot of Terminal in Rstudio"/>
                     <pic:cNvPicPr>
                       <a:picLocks noChangeAspect="1" noChangeArrowheads="1"/>
                     </pic:cNvPicPr>
                   </pic:nvPicPr>
                   <pic:blipFill>
-                    <a:blip r:embed="rId15"/>
+                    <a:blip r:embed="rId13"/>
                     <a:stretch>
                       <a:fillRect/>
                     </a:stretch>
@@ -1159,6 +1083,9 @@
     <w:p>
       <w:pPr>
         <w:pStyle w:val="SourceCode"/>
+        <w:rPr>
+          <w:rStyle w:val="NormalTok"/>
+        </w:rPr>
       </w:pPr>
       <w:r>
         <w:rPr>
@@ -1214,6 +1141,19 @@
         </w:rPr>
         <w:t xml:space="preserve"> course_data.tar.gz</w:t>
       </w:r>
+    </w:p>
+    <w:p>
+      <w:pPr>
+        <w:pStyle w:val="BodyText"/>
+      </w:pPr>
+      <w:r>
+        <w:t>Code ends here:</w:t>
+      </w:r>
+    </w:p>
+    <w:p>
+      <w:pPr>
+        <w:pStyle w:val="BodyText"/>
+      </w:pPr>
     </w:p>
     <w:tbl>
       <w:tblPr>
@@ -1230,13 +1170,14 @@
           <w:left w:w="144" w:type="dxa"/>
           <w:right w:w="144" w:type="dxa"/>
         </w:tblCellMar>
-        <w:tblLook w:val="0000" w:firstRow="0" w:lastRow="0" w:firstColumn="0" w:lastColumn="0" w:noHBand="0" w:noVBand="0"/>
+        <w:tblLook w:val="0020" w:firstRow="1" w:lastRow="0" w:firstColumn="0" w:lastColumn="0" w:noHBand="0" w:noVBand="0"/>
       </w:tblPr>
       <w:tblGrid>
-        <w:gridCol w:w="9648"/>
+        <w:gridCol w:w="9325"/>
       </w:tblGrid>
       <w:tr>
         <w:trPr>
+          <w:cnfStyle w:val="100000000000" w:firstRow="1" w:lastRow="0" w:firstColumn="0" w:lastColumn="0" w:oddVBand="0" w:evenVBand="0" w:oddHBand="0" w:evenHBand="0" w:firstRowFirstColumn="0" w:firstRowLastColumn="0" w:lastRowFirstColumn="0" w:lastRowLastColumn="0"/>
           <w:cantSplit/>
         </w:trPr>
         <w:tc>
@@ -1254,52 +1195,6 @@
               <w:spacing w:before="0" w:after="0"/>
               <w:textAlignment w:val="center"/>
             </w:pPr>
-            <w:r>
-              <w:rPr>
-                <w:noProof/>
-              </w:rPr>
-              <w:drawing>
-                <wp:inline distT="0" distB="0" distL="0" distR="0" wp14:anchorId="4F161D2F" wp14:editId="1E6A60F4">
-                  <wp:extent cx="152400" cy="152400"/>
-                  <wp:effectExtent l="0" t="0" r="0" b="0"/>
-                  <wp:docPr id="49" name="Picture"/>
-                  <wp:cNvGraphicFramePr/>
-                  <a:graphic xmlns:a="http://schemas.openxmlformats.org/drawingml/2006/main">
-                    <a:graphicData uri="http://schemas.openxmlformats.org/drawingml/2006/picture">
-                      <pic:pic xmlns:pic="http://schemas.openxmlformats.org/drawingml/2006/picture">
-                        <pic:nvPicPr>
-                          <pic:cNvPr id="50" name="Picture" descr="/Applications/RStudio.app/Contents/Resources/app/quarto/share/formats/docx/note.png"/>
-                          <pic:cNvPicPr>
-                            <a:picLocks noChangeAspect="1" noChangeArrowheads="1"/>
-                          </pic:cNvPicPr>
-                        </pic:nvPicPr>
-                        <pic:blipFill>
-                          <a:blip r:embed="rId8"/>
-                          <a:stretch>
-                            <a:fillRect/>
-                          </a:stretch>
-                        </pic:blipFill>
-                        <pic:spPr bwMode="auto">
-                          <a:xfrm>
-                            <a:off x="0" y="0"/>
-                            <a:ext cx="152400" cy="152400"/>
-                          </a:xfrm>
-                          <a:prstGeom prst="rect">
-                            <a:avLst/>
-                          </a:prstGeom>
-                          <a:noFill/>
-                          <a:ln w="9525">
-                            <a:noFill/>
-                            <a:headEnd/>
-                            <a:tailEnd/>
-                          </a:ln>
-                        </pic:spPr>
-                      </pic:pic>
-                    </a:graphicData>
-                  </a:graphic>
-                </wp:inline>
-              </w:drawing>
-            </w:r>
             <w:r>
               <w:t xml:space="preserve">  If on Windows</w:t>
             </w:r>
@@ -1326,7 +1221,7 @@
             <w:r>
               <w:t xml:space="preserve">If you’re using Windows, you can directly open the </w:t>
             </w:r>
-            <w:hyperlink r:id="rId16">
+            <w:hyperlink r:id="rId14">
               <w:r>
                 <w:rPr>
                   <w:rStyle w:val="Hyperlink"/>
@@ -1402,6 +1297,7 @@
         <w:rPr>
           <w:rStyle w:val="VerbatimChar"/>
         </w:rPr>
+        <w:lastRenderedPageBreak/>
         <w:t>│   │           ├── barcodes.tsv.gz</w:t>
       </w:r>
       <w:r>
@@ -1429,7 +1325,6 @@
         <w:rPr>
           <w:rStyle w:val="VerbatimChar"/>
         </w:rPr>
-        <w:lastRenderedPageBreak/>
         <w:t>│   ├── ETV6-RUNX1_2</w:t>
       </w:r>
       <w:r>
@@ -1791,7 +1686,11 @@
         <w:t>ETV6-RUNX1_1</w:t>
       </w:r>
       <w:r>
-        <w:t xml:space="preserve">). The count matrices are output of </w:t>
+        <w:t xml:space="preserve">). The count </w:t>
+      </w:r>
+      <w:r>
+        <w:lastRenderedPageBreak/>
+        <w:t xml:space="preserve">matrices are output of </w:t>
       </w:r>
       <w:r>
         <w:rPr>

</xml_diff>